<commit_message>
Deploying to gh-pages from @ Morrison-Lab/psw@83388bb40c73960d6779b72ef846298aa13e0ed0 🚀
</commit_message>
<xml_diff>
--- a/chapters/manuscript-submission.docx
+++ b/chapters/manuscript-submission.docx
@@ -15,7 +15,7 @@
         <w:pStyle w:val="Date"/>
       </w:pPr>
       <w:r>
-        <w:t xml:space="preserve">Last modified: 2026-10-02 08:36:57 (UTC)</w:t>
+        <w:t xml:space="preserve">Last modified: 2026-10-02 09:57:32 (UTC)</w:t>
       </w:r>
     </w:p>
     <w:p>
@@ -2227,7 +2227,7 @@
       </w:r>
     </w:p>
     <w:bookmarkEnd w:id="27"/>
-    <w:bookmarkStart w:id="28" w:name="figures"/>
+    <w:bookmarkStart w:id="29" w:name="figures"/>
     <w:p>
       <w:pPr>
         <w:pStyle w:val="Heading2"/>
@@ -2305,7 +2305,7 @@
         <w:t xml:space="preserve"> </w:t>
       </w:r>
       <w:r>
-        <w:t xml:space="preserve">and use font sizes that are readable at the final print size.</w:t>
+        <w:t xml:space="preserve">and use the same fonts across figures.</w:t>
       </w:r>
     </w:p>
     <w:p>
@@ -2317,6 +2317,317 @@
         </w:numPr>
       </w:pPr>
       <w:r>
+        <w:t xml:space="preserve">Size each figure for the page.</w:t>
+      </w:r>
+      <w:r>
+        <w:t xml:space="preserve"> </w:t>
+      </w:r>
+      <w:r>
+        <w:t xml:space="preserve">The plot should fill the available width,</w:t>
+      </w:r>
+      <w:r>
+        <w:t xml:space="preserve"> </w:t>
+      </w:r>
+      <w:r>
+        <w:t xml:space="preserve">meaning the text width or the journal’s stated figure width,</w:t>
+      </w:r>
+      <w:r>
+        <w:t xml:space="preserve"> </w:t>
+      </w:r>
+      <w:r>
+        <w:t xml:space="preserve">with no large blank margins or empty space inside the image.</w:t>
+      </w:r>
+      <w:r>
+        <w:t xml:space="preserve"> </w:t>
+      </w:r>
+      <w:r>
+        <w:t xml:space="preserve">All of its text should meet the journal’s stated minimum size,</w:t>
+      </w:r>
+      <w:r>
+        <w:t xml:space="preserve"> </w:t>
+      </w:r>
+      <w:r>
+        <w:t xml:space="preserve">and in any case be about 8 points or larger at the printed size.</w:t>
+      </w:r>
+      <w:r>
+        <w:t xml:space="preserve"> </w:t>
+      </w:r>
+      <w:r>
+        <w:t xml:space="preserve">Set the figure’s width and height to that width</w:t>
+      </w:r>
+      <w:r>
+        <w:t xml:space="preserve"> </w:t>
+      </w:r>
+      <w:r>
+        <w:t xml:space="preserve">and an aspect ratio that fits the content,</w:t>
+      </w:r>
+      <w:r>
+        <w:t xml:space="preserve"> </w:t>
+      </w:r>
+      <w:r>
+        <w:t xml:space="preserve">rather than exporting at a default size</w:t>
+      </w:r>
+      <w:r>
+        <w:t xml:space="preserve"> </w:t>
+      </w:r>
+      <w:r>
+        <w:t xml:space="preserve">and letting the document shrink it.</w:t>
+      </w:r>
+      <w:r>
+        <w:t xml:space="preserve"> </w:t>
+      </w:r>
+      <w:r>
+        <w:t xml:space="preserve">In a Quarto document,</w:t>
+      </w:r>
+      <w:r>
+        <w:t xml:space="preserve"> </w:t>
+      </w:r>
+      <w:r>
+        <w:t xml:space="preserve">set these with the chunk options</w:t>
+      </w:r>
+      <w:r>
+        <w:t xml:space="preserve"> </w:t>
+      </w:r>
+      <w:r>
+        <w:rPr>
+          <w:rStyle w:val="VerbatimChar"/>
+        </w:rPr>
+        <w:t xml:space="preserve">fig-width</w:t>
+      </w:r>
+      <w:r>
+        <w:t xml:space="preserve"> </w:t>
+      </w:r>
+      <w:r>
+        <w:t xml:space="preserve">and</w:t>
+      </w:r>
+      <w:r>
+        <w:t xml:space="preserve"> </w:t>
+      </w:r>
+      <w:r>
+        <w:rPr>
+          <w:rStyle w:val="VerbatimChar"/>
+        </w:rPr>
+        <w:t xml:space="preserve">fig-height</w:t>
+      </w:r>
+      <w:r>
+        <w:t xml:space="preserve">.</w:t>
+      </w:r>
+      <w:r>
+        <w:t xml:space="preserve"> </w:t>
+      </w:r>
+      <w:r>
+        <w:t xml:space="preserve">Wide diagrams such as Sankey plots often fail the size rule:</w:t>
+      </w:r>
+      <w:r>
+        <w:t xml:space="preserve"> </w:t>
+      </w:r>
+      <w:r>
+        <w:t xml:space="preserve">the plot ends up tiny in a field of white space.</w:t>
+      </w:r>
+      <w:r>
+        <w:t xml:space="preserve"> </w:t>
+      </w:r>
+      <w:r>
+        <w:t xml:space="preserve">For a ggplot in R,</w:t>
+      </w:r>
+      <w:r>
+        <w:t xml:space="preserve"> </w:t>
+      </w:r>
+      <w:r>
+        <w:t xml:space="preserve">the</w:t>
+      </w:r>
+      <w:r>
+        <w:t xml:space="preserve"> </w:t>
+      </w:r>
+      <w:hyperlink r:id="rId28">
+        <w:r>
+          <w:rPr>
+            <w:rStyle w:val="Hyperlink"/>
+          </w:rPr>
+          <w:t xml:space="preserve">ggview</w:t>
+        </w:r>
+      </w:hyperlink>
+      <w:r>
+        <w:t xml:space="preserve"> </w:t>
+      </w:r>
+      <w:r>
+        <w:t xml:space="preserve">package</w:t>
+      </w:r>
+      <w:r>
+        <w:t xml:space="preserve"> </w:t>
+      </w:r>
+      <w:r>
+        <w:t xml:space="preserve">previews the plot at its exact final width and height</w:t>
+      </w:r>
+      <w:r>
+        <w:t xml:space="preserve"> </w:t>
+      </w:r>
+      <w:r>
+        <w:t xml:space="preserve">(</w:t>
+      </w:r>
+      <w:r>
+        <w:rPr>
+          <w:rStyle w:val="VerbatimChar"/>
+        </w:rPr>
+        <w:t xml:space="preserve">canvas()</w:t>
+      </w:r>
+      <w:r>
+        <w:t xml:space="preserve">) and saves it at that size (</w:t>
+      </w:r>
+      <w:r>
+        <w:rPr>
+          <w:rStyle w:val="VerbatimChar"/>
+        </w:rPr>
+        <w:t xml:space="preserve">save_ggplot()</w:t>
+      </w:r>
+      <w:r>
+        <w:t xml:space="preserve">),</w:t>
+      </w:r>
+      <w:r>
+        <w:t xml:space="preserve"> </w:t>
+      </w:r>
+      <w:r>
+        <w:t xml:space="preserve">so you can fix the layout before rendering the document.</w:t>
+      </w:r>
+      <w:r>
+        <w:t xml:space="preserve"> </w:t>
+      </w:r>
+      <w:r>
+        <w:t xml:space="preserve">The preview needs the RStudio IDE;</w:t>
+      </w:r>
+      <w:r>
+        <w:t xml:space="preserve"> </w:t>
+      </w:r>
+      <w:r>
+        <w:t xml:space="preserve">in another editor, save the plot with</w:t>
+      </w:r>
+      <w:r>
+        <w:t xml:space="preserve"> </w:t>
+      </w:r>
+      <w:r>
+        <w:rPr>
+          <w:rStyle w:val="VerbatimChar"/>
+        </w:rPr>
+        <w:t xml:space="preserve">save_ggplot()</w:t>
+      </w:r>
+      <w:r>
+        <w:t xml:space="preserve"> </w:t>
+      </w:r>
+      <w:r>
+        <w:t xml:space="preserve">and open the saved file instead.</w:t>
+      </w:r>
+      <w:r>
+        <w:t xml:space="preserve"> </w:t>
+      </w:r>
+      <w:r>
+        <w:t xml:space="preserve">Remove</w:t>
+      </w:r>
+      <w:r>
+        <w:t xml:space="preserve"> </w:t>
+      </w:r>
+      <w:r>
+        <w:rPr>
+          <w:rStyle w:val="VerbatimChar"/>
+        </w:rPr>
+        <w:t xml:space="preserve">canvas()</w:t>
+      </w:r>
+      <w:r>
+        <w:t xml:space="preserve"> </w:t>
+      </w:r>
+      <w:r>
+        <w:t xml:space="preserve">from any plot that the document prints.</w:t>
+      </w:r>
+      <w:r>
+        <w:t xml:space="preserve"> </w:t>
+      </w:r>
+      <w:r>
+        <w:t xml:space="preserve">A printed plot that still carries it goes to the IDE’s viewer pane</w:t>
+      </w:r>
+      <w:r>
+        <w:t xml:space="preserve"> </w:t>
+      </w:r>
+      <w:r>
+        <w:t xml:space="preserve">instead of the document,</w:t>
+      </w:r>
+      <w:r>
+        <w:t xml:space="preserve"> </w:t>
+      </w:r>
+      <w:r>
+        <w:t xml:space="preserve">so the render either stops with an error</w:t>
+      </w:r>
+      <w:r>
+        <w:t xml:space="preserve"> </w:t>
+      </w:r>
+      <w:r>
+        <w:t xml:space="preserve">or leaves the figure out.</w:t>
+      </w:r>
+      <w:r>
+        <w:t xml:space="preserve"> </w:t>
+      </w:r>
+      <w:r>
+        <w:t xml:space="preserve">A plot saved with</w:t>
+      </w:r>
+      <w:r>
+        <w:t xml:space="preserve"> </w:t>
+      </w:r>
+      <w:r>
+        <w:rPr>
+          <w:rStyle w:val="VerbatimChar"/>
+        </w:rPr>
+        <w:t xml:space="preserve">save_ggplot()</w:t>
+      </w:r>
+      <w:r>
+        <w:t xml:space="preserve"> </w:t>
+      </w:r>
+      <w:r>
+        <w:t xml:space="preserve">can keep its</w:t>
+      </w:r>
+      <w:r>
+        <w:t xml:space="preserve"> </w:t>
+      </w:r>
+      <w:r>
+        <w:rPr>
+          <w:rStyle w:val="VerbatimChar"/>
+        </w:rPr>
+        <w:t xml:space="preserve">canvas()</w:t>
+      </w:r>
+      <w:r>
+        <w:t xml:space="preserve">,</w:t>
+      </w:r>
+      <w:r>
+        <w:t xml:space="preserve"> </w:t>
+      </w:r>
+      <w:r>
+        <w:t xml:space="preserve">since that is where the saved size comes from.</w:t>
+      </w:r>
+      <w:r>
+        <w:t xml:space="preserve"> </w:t>
+      </w:r>
+      <w:r>
+        <w:t xml:space="preserve">Check each figure on the rendered page.</w:t>
+      </w:r>
+      <w:r>
+        <w:t xml:space="preserve"> </w:t>
+      </w:r>
+      <w:r>
+        <w:t xml:space="preserve">Figure text far smaller than the caption beneath it</w:t>
+      </w:r>
+      <w:r>
+        <w:t xml:space="preserve"> </w:t>
+      </w:r>
+      <w:r>
+        <w:t xml:space="preserve">is almost certainly below 8 points.</w:t>
+      </w:r>
+    </w:p>
+    <w:p>
+      <w:pPr>
+        <w:pStyle w:val="Compact"/>
+        <w:numPr>
+          <w:ilvl w:val="0"/>
+          <w:numId w:val="1012"/>
+        </w:numPr>
+      </w:pPr>
+      <w:r>
         <w:t xml:space="preserve">Use colorblind-safe palettes.</w:t>
       </w:r>
       <w:r>
@@ -2410,8 +2721,8 @@
         <w:t xml:space="preserve">Add alt text when the journal supports it.</w:t>
       </w:r>
     </w:p>
-    <w:bookmarkEnd w:id="28"/>
-    <w:bookmarkStart w:id="29" w:name="statistics-and-numbers"/>
+    <w:bookmarkEnd w:id="29"/>
+    <w:bookmarkStart w:id="30" w:name="statistics-and-numbers"/>
     <w:p>
       <w:pPr>
         <w:pStyle w:val="Heading2"/>
@@ -2918,8 +3229,8 @@
         <w:t xml:space="preserve">rather than retyping them.</w:t>
       </w:r>
     </w:p>
-    <w:bookmarkEnd w:id="29"/>
-    <w:bookmarkStart w:id="30" w:name="supplement"/>
+    <w:bookmarkEnd w:id="30"/>
+    <w:bookmarkStart w:id="31" w:name="supplement"/>
     <w:p>
       <w:pPr>
         <w:pStyle w:val="Heading2"/>
@@ -3168,8 +3479,8 @@
         <w:t xml:space="preserve">Hold the supplement to the same standard as the main text.</w:t>
       </w:r>
     </w:p>
-    <w:bookmarkEnd w:id="30"/>
-    <w:bookmarkStart w:id="31" w:name="abbreviations"/>
+    <w:bookmarkEnd w:id="31"/>
+    <w:bookmarkStart w:id="32" w:name="abbreviations"/>
     <w:p>
       <w:pPr>
         <w:pStyle w:val="Heading2"/>
@@ -3256,8 +3567,8 @@
         <w:t xml:space="preserve">Check the journal’s list.</w:t>
       </w:r>
     </w:p>
-    <w:bookmarkEnd w:id="31"/>
-    <w:bookmarkStart w:id="33" w:name="references"/>
+    <w:bookmarkEnd w:id="32"/>
+    <w:bookmarkStart w:id="34" w:name="references"/>
     <w:p>
       <w:pPr>
         <w:pStyle w:val="Heading2"/>
@@ -3373,7 +3684,7 @@
       <w:r>
         <w:t xml:space="preserve"> </w:t>
       </w:r>
-      <w:hyperlink r:id="rId32">
+      <w:hyperlink r:id="rId33">
         <w:r>
           <w:rPr>
             <w:rStyle w:val="Hyperlink"/>
@@ -3409,8 +3720,8 @@
         <w:t xml:space="preserve">Cite the software and R packages that the analysis relied on.</w:t>
       </w:r>
     </w:p>
-    <w:bookmarkEnd w:id="33"/>
-    <w:bookmarkStart w:id="35" w:name="prose"/>
+    <w:bookmarkEnd w:id="34"/>
+    <w:bookmarkStart w:id="36" w:name="prose"/>
     <w:p>
       <w:pPr>
         <w:pStyle w:val="Heading2"/>
@@ -3589,7 +3900,7 @@
       <w:r>
         <w:t xml:space="preserve"> </w:t>
       </w:r>
-      <w:hyperlink r:id="rId34">
+      <w:hyperlink r:id="rId35">
         <w:r>
           <w:rPr>
             <w:rStyle w:val="Hyperlink"/>
@@ -3715,8 +4026,8 @@
         <w:t xml:space="preserve">Define every group, period, and outcome before you use it.</w:t>
       </w:r>
     </w:p>
-    <w:bookmarkEnd w:id="35"/>
-    <w:bookmarkStart w:id="37" w:name="required-statements"/>
+    <w:bookmarkEnd w:id="36"/>
+    <w:bookmarkStart w:id="38" w:name="required-statements"/>
     <w:p>
       <w:pPr>
         <w:pStyle w:val="Heading2"/>
@@ -3765,7 +4076,7 @@
       <w:r>
         <w:t xml:space="preserve"> </w:t>
       </w:r>
-      <w:hyperlink r:id="rId36">
+      <w:hyperlink r:id="rId37">
         <w:r>
           <w:rPr>
             <w:rStyle w:val="Hyperlink"/>
@@ -3843,8 +4154,8 @@
         <w:t xml:space="preserve">prior presentation or preprints.</w:t>
       </w:r>
     </w:p>
-    <w:bookmarkEnd w:id="37"/>
-    <w:bookmarkStart w:id="38" w:name="rendering-and-layout-in-quarto"/>
+    <w:bookmarkEnd w:id="38"/>
+    <w:bookmarkStart w:id="39" w:name="rendering-and-layout-in-quarto"/>
     <w:p>
       <w:pPr>
         <w:pStyle w:val="Heading2"/>
@@ -3966,8 +4277,8 @@
         <w:t xml:space="preserve">Check that every cross-reference resolves.</w:t>
       </w:r>
     </w:p>
-    <w:bookmarkEnd w:id="38"/>
-    <w:bookmarkStart w:id="39" w:name="submission-checklist"/>
+    <w:bookmarkEnd w:id="39"/>
+    <w:bookmarkStart w:id="40" w:name="submission-checklist"/>
     <w:p>
       <w:pPr>
         <w:pStyle w:val="Heading2"/>
@@ -4077,7 +4388,19 @@
         <w:t xml:space="preserve"> </w:t>
       </w:r>
       <w:r>
-        <w:t xml:space="preserve">and no figure is cropped or blurry.</w:t>
+        <w:t xml:space="preserve">no figure is cropped or blurry,</w:t>
+      </w:r>
+      <w:r>
+        <w:t xml:space="preserve"> </w:t>
+      </w:r>
+      <w:r>
+        <w:t xml:space="preserve">and every figure fills the available width without large blank margins,</w:t>
+      </w:r>
+      <w:r>
+        <w:t xml:space="preserve"> </w:t>
+      </w:r>
+      <w:r>
+        <w:t xml:space="preserve">with its smallest text about 8 points or larger.</w:t>
       </w:r>
     </w:p>
     <w:p>
@@ -4407,7 +4730,7 @@
         <w:t xml:space="preserve">and any suggested or excluded reviewers.</w:t>
       </w:r>
     </w:p>
-    <w:bookmarkEnd w:id="39"/>
+    <w:bookmarkEnd w:id="40"/>
     <w:sectPr>
       <w:footnotePr>
         <w:numRestart w:val="eachSect"/>

</xml_diff>

<commit_message>
Deploying to gh-pages from @ Morrison-Lab/psw@5823bc80ff22ba1868aed3bda797dc8a7f75171f 🚀
</commit_message>
<xml_diff>
--- a/chapters/manuscript-submission.docx
+++ b/chapters/manuscript-submission.docx
@@ -15,7 +15,7 @@
         <w:pStyle w:val="Date"/>
       </w:pPr>
       <w:r>
-        <w:t xml:space="preserve">Last modified: 2026-10-02 09:57:32 (UTC)</w:t>
+        <w:t xml:space="preserve">Last modified: 2026-10-02 10:17:46 (UTC)</w:t>
       </w:r>
     </w:p>
     <w:p>
@@ -876,6 +876,44 @@
       </w:r>
       <w:r>
         <w:t xml:space="preserve">values.</w:t>
+      </w:r>
+      <w:r>
+        <w:t xml:space="preserve"> </w:t>
+      </w:r>
+      <w:r>
+        <w:t xml:space="preserve">Phrase each effect estimate as an estimate</w:t>
+      </w:r>
+      <w:r>
+        <w:t xml:space="preserve"> </w:t>
+      </w:r>
+      <w:r>
+        <w:t xml:space="preserve">(</w:t>
+      </w:r>
+      <w:r>
+        <w:t xml:space="preserve">“we estimated that …”</w:t>
+      </w:r>
+      <w:r>
+        <w:t xml:space="preserve">),</w:t>
+      </w:r>
+      <w:r>
+        <w:t xml:space="preserve"> </w:t>
+      </w:r>
+      <w:r>
+        <w:t xml:space="preserve">per</w:t>
+      </w:r>
+      <w:r>
+        <w:t xml:space="preserve"> </w:t>
+      </w:r>
+      <w:hyperlink w:anchor="statistics-and-numbers">
+        <w:r>
+          <w:rPr>
+            <w:rStyle w:val="Hyperlink"/>
+          </w:rPr>
+          <w:t xml:space="preserve">Statistics and numbers</w:t>
+        </w:r>
+      </w:hyperlink>
+      <w:r>
+        <w:t xml:space="preserve">.</w:t>
       </w:r>
       <w:r>
         <w:t xml:space="preserve"> </w:t>
@@ -2791,6 +2829,78 @@
         </w:numPr>
       </w:pPr>
       <w:r>
+        <w:t xml:space="preserve">Describe an estimate as an estimate, in the abstract too.</w:t>
+      </w:r>
+      <w:r>
+        <w:t xml:space="preserve"> </w:t>
+      </w:r>
+      <w:r>
+        <w:t xml:space="preserve">Write</w:t>
+      </w:r>
+      <w:r>
+        <w:t xml:space="preserve"> </w:t>
+      </w:r>
+      <w:r>
+        <w:t xml:space="preserve">“Under the stated difference-in-differences assumptions,</w:t>
+      </w:r>
+      <w:r>
+        <w:t xml:space="preserve"> </w:t>
+      </w:r>
+      <w:r>
+        <w:t xml:space="preserve">we estimated that the intervention reduced time in notes</w:t>
+      </w:r>
+      <w:r>
+        <w:t xml:space="preserve"> </w:t>
+      </w:r>
+      <w:r>
+        <w:t xml:space="preserve">by 1.26 minutes (95% CI, 0.68 to 1.84)”</w:t>
+      </w:r>
+      <w:r>
+        <w:t xml:space="preserve">,</w:t>
+      </w:r>
+      <w:r>
+        <w:t xml:space="preserve"> </w:t>
+      </w:r>
+      <w:r>
+        <w:t xml:space="preserve">not</w:t>
+      </w:r>
+      <w:r>
+        <w:t xml:space="preserve"> </w:t>
+      </w:r>
+      <w:r>
+        <w:t xml:space="preserve">“Under the stated difference-in-differences assumptions,</w:t>
+      </w:r>
+      <w:r>
+        <w:t xml:space="preserve"> </w:t>
+      </w:r>
+      <w:r>
+        <w:t xml:space="preserve">the intervention reduced time in notes by 1.26 minutes”</w:t>
+      </w:r>
+      <w:r>
+        <w:t xml:space="preserve">.</w:t>
+      </w:r>
+      <w:r>
+        <w:t xml:space="preserve"> </w:t>
+      </w:r>
+      <w:r>
+        <w:t xml:space="preserve">A point estimate stated as a bare fact</w:t>
+      </w:r>
+      <w:r>
+        <w:t xml:space="preserve"> </w:t>
+      </w:r>
+      <w:r>
+        <w:t xml:space="preserve">reads as a known value rather than as an estimate from the data.</w:t>
+      </w:r>
+    </w:p>
+    <w:p>
+      <w:pPr>
+        <w:pStyle w:val="Compact"/>
+        <w:numPr>
+          <w:ilvl w:val="0"/>
+          <w:numId w:val="1013"/>
+        </w:numPr>
+      </w:pPr>
+      <w:r>
         <w:t xml:space="preserve">Report exact</w:t>
       </w:r>
       <w:r>
@@ -3115,7 +3225,37 @@
         <w:t xml:space="preserve"> </w:t>
       </w:r>
       <w:r>
-        <w:t xml:space="preserve">Use the same precision for the same quantity everywhere.</w:t>
+        <w:t xml:space="preserve">Use the same precision for the same quantity everywhere,</w:t>
+      </w:r>
+      <w:r>
+        <w:t xml:space="preserve"> </w:t>
+      </w:r>
+      <w:r>
+        <w:t xml:space="preserve">and give a point estimate and both bounds of its interval</w:t>
+      </w:r>
+      <w:r>
+        <w:t xml:space="preserve"> </w:t>
+      </w:r>
+      <w:r>
+        <w:t xml:space="preserve">the same number of decimal places:</w:t>
+      </w:r>
+      <w:r>
+        <w:t xml:space="preserve"> </w:t>
+      </w:r>
+      <w:r>
+        <w:t xml:space="preserve">“1.26 (95% CI, 0.68 to 1.84)”</w:t>
+      </w:r>
+      <w:r>
+        <w:t xml:space="preserve">, not</w:t>
+      </w:r>
+      <w:r>
+        <w:t xml:space="preserve"> </w:t>
+      </w:r>
+      <w:r>
+        <w:t xml:space="preserve">“1.26 (95% CI, 0.675 to 1.84)”</w:t>
+      </w:r>
+      <w:r>
+        <w:t xml:space="preserve">.</w:t>
       </w:r>
     </w:p>
     <w:p>
@@ -4542,6 +4682,18 @@
       </w:pPr>
       <w:r>
         <w:t xml:space="preserve">Every estimate has a 95% CI,</w:t>
+      </w:r>
+      <w:r>
+        <w:t xml:space="preserve"> </w:t>
+      </w:r>
+      <w:r>
+        <w:t xml:space="preserve">is phrased as an estimate,</w:t>
+      </w:r>
+      <w:r>
+        <w:t xml:space="preserve"> </w:t>
+      </w:r>
+      <w:r>
+        <w:t xml:space="preserve">and shares its decimal places with its CI,</w:t>
       </w:r>
       <w:r>
         <w:t xml:space="preserve"> </w:t>

</xml_diff>

<commit_message>
Deploying to gh-pages from @ Morrison-Lab/psw@590a4e58c120d7643438cfe05a2cea06d374ef08 🚀
</commit_message>
<xml_diff>
--- a/chapters/manuscript-submission.docx
+++ b/chapters/manuscript-submission.docx
@@ -15,7 +15,7 @@
         <w:pStyle w:val="Date"/>
       </w:pPr>
       <w:r>
-        <w:t xml:space="preserve">Last modified: 2026-10-05 19:21:40 (UTC)</w:t>
+        <w:t xml:space="preserve">Last modified: 2026-10-05 21:53:36 (UTC)</w:t>
       </w:r>
     </w:p>
     <w:p>
@@ -3360,13 +3360,31 @@
         <w:t xml:space="preserve"> </w:t>
       </w:r>
       <w:r>
-        <w:t xml:space="preserve">Generate them from code, such as inline R in Quarto,</w:t>
-      </w:r>
-      <w:r>
-        <w:t xml:space="preserve"> </w:t>
-      </w:r>
-      <w:r>
-        <w:t xml:space="preserve">rather than retyping them.</w:t>
+        <w:t xml:space="preserve">Generate every number that comes from the analysis</w:t>
+      </w:r>
+      <w:r>
+        <w:t xml:space="preserve"> </w:t>
+      </w:r>
+      <w:r>
+        <w:t xml:space="preserve">with code, such as an inline R expression in Quarto,</w:t>
+      </w:r>
+      <w:r>
+        <w:t xml:space="preserve"> </w:t>
+      </w:r>
+      <w:r>
+        <w:t xml:space="preserve">rather than typing it into the prose.</w:t>
+      </w:r>
+      <w:r>
+        <w:t xml:space="preserve"> </w:t>
+      </w:r>
+      <w:r>
+        <w:t xml:space="preserve">A typed number goes stale when the data or the analysis changes,</w:t>
+      </w:r>
+      <w:r>
+        <w:t xml:space="preserve"> </w:t>
+      </w:r>
+      <w:r>
+        <w:t xml:space="preserve">and nothing warns you that it no longer matches the tables.</w:t>
       </w:r>
     </w:p>
     <w:bookmarkEnd w:id="30"/>

</xml_diff>

<commit_message>
Deploying to gh-pages from @ Morrison-Lab/psw@a8d36643d67e4d320844a502e41889e9a52dbb56 🚀
</commit_message>
<xml_diff>
--- a/chapters/manuscript-submission.docx
+++ b/chapters/manuscript-submission.docx
@@ -15,7 +15,7 @@
         <w:pStyle w:val="Date"/>
       </w:pPr>
       <w:r>
-        <w:t xml:space="preserve">Last modified: 2026-10-26 09:06:18 (PDT)</w:t>
+        <w:t xml:space="preserve">Last modified: 2026-10-26 10:30:09 (PDT)</w:t>
       </w:r>
     </w:p>
     <w:p>
@@ -1564,13 +1564,31 @@
         </w:r>
       </w:hyperlink>
       <w:r>
-        <w:t xml:space="preserve">,</w:t>
-      </w:r>
-      <w:r>
-        <w:t xml:space="preserve"> </w:t>
-      </w:r>
-      <w:r>
-        <w:t xml:space="preserve">follow it while writing,</w:t>
+        <w:t xml:space="preserve"> </w:t>
+      </w:r>
+      <w:r>
+        <w:t xml:space="preserve">website,</w:t>
+      </w:r>
+      <w:r>
+        <w:t xml:space="preserve"> </w:t>
+      </w:r>
+      <w:r>
+        <w:t xml:space="preserve">which catalogs reporting guidelines for health research</w:t>
+      </w:r>
+      <w:r>
+        <w:t xml:space="preserve"> </w:t>
+      </w:r>
+      <w:r>
+        <w:t xml:space="preserve">(Simera et al. 2010)</w:t>
+      </w:r>
+      <w:r>
+        <w:t xml:space="preserve">.</w:t>
+      </w:r>
+      <w:r>
+        <w:t xml:space="preserve"> </w:t>
+      </w:r>
+      <w:r>
+        <w:t xml:space="preserve">Follow the guideline while writing,</w:t>
       </w:r>
       <w:r>
         <w:t xml:space="preserve"> </w:t>
@@ -1593,13 +1611,13 @@
         <w:t xml:space="preserve"> </w:t>
       </w:r>
       <w:r>
-        <w:t xml:space="preserve">lists the common ones.</w:t>
-      </w:r>
-      <w:r>
-        <w:t xml:space="preserve"> </w:t>
-      </w:r>
-      <w:r>
-        <w:t xml:space="preserve">Check the EQUATOR page for the current version before citing one.</w:t>
+        <w:t xml:space="preserve">lists the common guidelines.</w:t>
+      </w:r>
+      <w:r>
+        <w:t xml:space="preserve"> </w:t>
+      </w:r>
+      <w:r>
+        <w:t xml:space="preserve">Check the EQUATOR Network website for the current version of a guideline before citing it.</w:t>
       </w:r>
     </w:p>
     <w:tbl>
@@ -4450,7 +4468,7 @@
       </w:r>
     </w:p>
     <w:bookmarkEnd w:id="40"/>
-    <w:bookmarkStart w:id="41" w:name="submission-checklist"/>
+    <w:bookmarkStart w:id="44" w:name="submission-checklist"/>
     <w:p>
       <w:pPr>
         <w:pStyle w:val="Heading2"/>
@@ -4928,7 +4946,55 @@
         <w:t xml:space="preserve">and any suggested or excluded reviewers.</w:t>
       </w:r>
     </w:p>
-    <w:bookmarkEnd w:id="41"/>
+    <w:bookmarkStart w:id="43" w:name="refs"/>
+    <w:bookmarkStart w:id="42" w:name="ref-simera2010catalogue"/>
+    <w:p>
+      <w:pPr>
+        <w:pStyle w:val="Bibliography"/>
+      </w:pPr>
+      <w:r>
+        <w:t xml:space="preserve">Simera, Iveta, David Moher, John Hoey, Kenneth F. Schulz, and Douglas G. Altman. 2010.</w:t>
+      </w:r>
+      <w:r>
+        <w:t xml:space="preserve"> </w:t>
+      </w:r>
+      <w:r>
+        <w:t xml:space="preserve">“A Catalogue of Reporting Guidelines for Health Research.”</w:t>
+      </w:r>
+      <w:r>
+        <w:t xml:space="preserve"> </w:t>
+      </w:r>
+      <w:r>
+        <w:rPr>
+          <w:i/>
+          <w:iCs/>
+        </w:rPr>
+        <w:t xml:space="preserve">European Journal of Clinical Investigation</w:t>
+      </w:r>
+      <w:r>
+        <w:t xml:space="preserve"> </w:t>
+      </w:r>
+      <w:r>
+        <w:t xml:space="preserve">40 (1): 35–53.</w:t>
+      </w:r>
+      <w:r>
+        <w:t xml:space="preserve"> </w:t>
+      </w:r>
+      <w:hyperlink r:id="rId41">
+        <w:r>
+          <w:rPr>
+            <w:rStyle w:val="Hyperlink"/>
+          </w:rPr>
+          <w:t xml:space="preserve">https://doi.org/10.1111/j.1365-2362.2009.02234.x</w:t>
+        </w:r>
+      </w:hyperlink>
+      <w:r>
+        <w:t xml:space="preserve">.</w:t>
+      </w:r>
+    </w:p>
+    <w:bookmarkEnd w:id="42"/>
+    <w:bookmarkEnd w:id="43"/>
+    <w:bookmarkEnd w:id="44"/>
     <w:sectPr>
       <w:footnotePr>
         <w:numRestart w:val="eachSect"/>

</xml_diff>